<commit_message>
Update architecture files to remove DB roh reference and add RAG Knowledge Ingestion Pipeline
</commit_message>
<xml_diff>
--- a/PROJECT_OVERALL_ARCHITECTURE.docx
+++ b/PROJECT_OVERALL_ARCHITECTURE.docx
@@ -15,7 +15,7 @@
         </w:rPr>
         <w:t>HRMs-ERP &amp; HRMs-AI Engine</w:t>
         <w:br/>
-        <w:t>Master Architecture Blueprint</w:t>
+        <w:t>Master Architecture &amp; RAG Ingestion Blueprint</w:t>
       </w:r>
     </w:p>
     <w:p>
@@ -28,7 +28,7 @@
           <w:color w:val="64748B"/>
           <w:sz w:val="22"/>
         </w:rPr>
-        <w:t>Enterprise System Blueprint, Architecture Chart &amp; Technology Roadmap</w:t>
+        <w:t>Enterprise Architecture, RAG Knowledge Feeding Pipeline &amp; Advanced Technology Roadmap</w:t>
         <w:br/>
         <w:t>Version 2.5.0 Production | August 2026</w:t>
       </w:r>
@@ -120,7 +120,7 @@
         <w:br/>
         <w:t>+-----------------------------------------------------------------------------------------+</w:t>
         <w:br/>
-        <w:t>|  4. HRMs-AI ENGINE &amp; INTENT ROUTER                                                      |</w:t>
+        <w:t>|  4. HRMs-AI ENGINE &amp; RAG KNOWLEDGE INGESTION                                            |</w:t>
         <w:br/>
         <w:t>|  RAG Grounded Policy Chatbot (ragService)  |  Autonomous Action Agent (agentService)    |</w:t>
         <w:br/>
@@ -134,9 +134,9 @@
         <w:br/>
         <w:t>+-----------------------------------------------------------------------------------------+</w:t>
         <w:br/>
-        <w:t>|  5. DATABASE &amp; CLOUD LAYER                                                              |</w:t>
+        <w:t>|  5. ENTERPRISE DATABASE &amp; CLOUD LAYER                                                   |</w:t>
         <w:br/>
-        <w:t>|  Google Gemini (gemini-3.6-flash / embedding-001) &lt;-&gt; MySQL 8.0 (DB: roh @ 3306)       |</w:t>
+        <w:t>|  Google Gemini (gemini-3.6-flash / embedding-001) &lt;-&gt; Enterprise Relational Database    |</w:t>
         <w:br/>
         <w:t>+-----------------------------------------------------------------------------------------+</w:t>
         <w:br/>
@@ -164,7 +164,131 @@
           <w:color w:val="003470"/>
           <w:sz w:val="32"/>
         </w:rPr>
-        <w:t>3. Core Subsystem Layer Breakdown</w:t>
+        <w:t>3. Feeding Knowledge to the AI Agent (RAG Ingestion Pipeline)</w:t>
+      </w:r>
+    </w:p>
+    <w:p>
+      <w:pPr>
+        <w:spacing w:before="80" w:after="80"/>
+      </w:pPr>
+      <w:r>
+        <w:rPr>
+          <w:rFonts w:ascii="Arial" w:hAnsi="Arial"/>
+          <w:b/>
+          <w:color w:val="003470"/>
+          <w:sz w:val="20"/>
+        </w:rPr>
+        <w:t xml:space="preserve">• Step 1: Document Collection &amp; Raw Extraction: </w:t>
+      </w:r>
+      <w:r>
+        <w:rPr>
+          <w:rFonts w:ascii="Arial" w:hAnsi="Arial"/>
+          <w:color w:val="1E293B"/>
+          <w:sz w:val="20"/>
+        </w:rPr>
+        <w:t>Company knowledge is gathered from raw files including HR Leave Manuals, Employee Handbooks, IT/AV SOPs, Benefits Guidelines, and Resolved Ticket Histories.</w:t>
+      </w:r>
+    </w:p>
+    <w:p>
+      <w:pPr>
+        <w:spacing w:before="80" w:after="80"/>
+      </w:pPr>
+      <w:r>
+        <w:rPr>
+          <w:rFonts w:ascii="Arial" w:hAnsi="Arial"/>
+          <w:b/>
+          <w:color w:val="003470"/>
+          <w:sz w:val="20"/>
+        </w:rPr>
+        <w:t xml:space="preserve">• Step 2: Semantic Chunking &amp; Metadata Tagging: </w:t>
+      </w:r>
+      <w:r>
+        <w:rPr>
+          <w:rFonts w:ascii="Arial" w:hAnsi="Arial"/>
+          <w:color w:val="1E293B"/>
+          <w:sz w:val="20"/>
+        </w:rPr>
+        <w:t>Long documents are broken into optimal 500-1000 character overlapping text chunks. Each chunk is tagged with structured metadata (category, department, target_role, updated_timestamp).</w:t>
+      </w:r>
+    </w:p>
+    <w:p>
+      <w:pPr>
+        <w:spacing w:before="80" w:after="80"/>
+      </w:pPr>
+      <w:r>
+        <w:rPr>
+          <w:rFonts w:ascii="Arial" w:hAnsi="Arial"/>
+          <w:b/>
+          <w:color w:val="003470"/>
+          <w:sz w:val="20"/>
+        </w:rPr>
+        <w:t xml:space="preserve">• Step 3: High-Dimensional Vector Embedding: </w:t>
+      </w:r>
+      <w:r>
+        <w:rPr>
+          <w:rFonts w:ascii="Arial" w:hAnsi="Arial"/>
+          <w:color w:val="1E293B"/>
+          <w:sz w:val="20"/>
+        </w:rPr>
+        <w:t>Text chunks are passed through the Google Gemini Embedding API (gemini-embedding-001) to generate 3072-dimensional math vector representations.</w:t>
+      </w:r>
+    </w:p>
+    <w:p>
+      <w:pPr>
+        <w:spacing w:before="80" w:after="80"/>
+      </w:pPr>
+      <w:r>
+        <w:rPr>
+          <w:rFonts w:ascii="Arial" w:hAnsi="Arial"/>
+          <w:b/>
+          <w:color w:val="003470"/>
+          <w:sz w:val="20"/>
+        </w:rPr>
+        <w:t xml:space="preserve">• Step 4: Dual Indexing (Vector + BM25 Full-Text): </w:t>
+      </w:r>
+      <w:r>
+        <w:rPr>
+          <w:rFonts w:ascii="Arial" w:hAnsi="Arial"/>
+          <w:color w:val="1E293B"/>
+          <w:sz w:val="20"/>
+        </w:rPr>
+        <w:t>Chunks, metadata, and 3072-dim vector embeddings are stored in the knowledge_chunks database table with both BM25 Full-Text and Cosine Similarity vector indexes.</w:t>
+      </w:r>
+    </w:p>
+    <w:p>
+      <w:pPr>
+        <w:spacing w:before="80" w:after="80"/>
+      </w:pPr>
+      <w:r>
+        <w:rPr>
+          <w:rFonts w:ascii="Arial" w:hAnsi="Arial"/>
+          <w:b/>
+          <w:color w:val="003470"/>
+          <w:sz w:val="20"/>
+        </w:rPr>
+        <w:t xml:space="preserve">• Step 5: Real-Time Hybrid Retrieval &amp; Prompt Grounding: </w:t>
+      </w:r>
+      <w:r>
+        <w:rPr>
+          <w:rFonts w:ascii="Arial" w:hAnsi="Arial"/>
+          <w:color w:val="1E293B"/>
+          <w:sz w:val="20"/>
+        </w:rPr>
+        <w:t>When an employee asks a question, the query vector is generated and searched using Hybrid Search (Cosine Similarity + BM25). Top K matched contexts are injected into Gemini system prompts for zero-hallucination answers.</w:t>
+      </w:r>
+    </w:p>
+    <w:p>
+      <w:pPr>
+        <w:spacing w:before="280" w:after="120"/>
+      </w:pPr>
+      <w:r>
+        <w:rPr>
+          <w:rFonts w:ascii="Arial" w:hAnsi="Arial"/>
+          <w:b/>
+          <w:color w:val="003470"/>
+          <w:sz w:val="32"/>
+        </w:rPr>
+        <w:t>4. Core Subsystem Layer Breakdown</w:t>
       </w:r>
     </w:p>
     <w:tbl>
@@ -462,7 +586,7 @@
                 <w:color w:val="1E293B"/>
                 <w:sz w:val="19"/>
               </w:rPr>
-              <w:t>Google Gemini Cloud (gemini-3.6-flash &amp; gemini-embedding-001), MySQL 8.0 Database (roh @ 127.0.0.1:3306).</w:t>
+              <w:t>Google Gemini Cloud (gemini-3.6-flash &amp; gemini-embedding-001), Enterprise Relational Database.</w:t>
             </w:r>
           </w:p>
         </w:tc>
@@ -526,7 +650,7 @@
           <w:color w:val="003470"/>
           <w:sz w:val="32"/>
         </w:rPr>
-        <w:t>4. Advanced Technologies Roadmap</w:t>
+        <w:t>5. Advanced Technologies Roadmap</w:t>
       </w:r>
     </w:p>
     <w:p>

</xml_diff>

<commit_message>
Update architecture blueprint: Replace Gemini with Proprietary Custom AI strategy, add AI Agent portfolio, and 10-year language evaluation
</commit_message>
<xml_diff>
--- a/PROJECT_OVERALL_ARCHITECTURE.docx
+++ b/PROJECT_OVERALL_ARCHITECTURE.docx
@@ -11,11 +11,11 @@
           <w:rFonts w:ascii="Arial" w:hAnsi="Arial"/>
           <w:b/>
           <w:color w:val="003470"/>
-          <w:sz w:val="48"/>
+          <w:sz w:val="44"/>
         </w:rPr>
-        <w:t>HRMs-ERP &amp; HRMs-AI Engine</w:t>
+        <w:t>HRMs-ERP &amp; Proprietary Custom AI Engine</w:t>
         <w:br/>
-        <w:t>Master Architecture &amp; RAG Ingestion Blueprint</w:t>
+        <w:t>Master Architecture &amp; 10-Year Strategy Blueprint</w:t>
       </w:r>
     </w:p>
     <w:p>
@@ -28,9 +28,9 @@
           <w:color w:val="64748B"/>
           <w:sz w:val="22"/>
         </w:rPr>
-        <w:t>Enterprise Architecture, RAG Knowledge Feeding Pipeline &amp; Advanced Technology Roadmap</w:t>
+        <w:t>Proprietary AI Strategy, Agent Portfolio &amp; 10-Year Native Language Evaluation</w:t>
         <w:br/>
-        <w:t>Version 2.5.0 Production | August 2026</w:t>
+        <w:t>Version 3.0.0 Custom AI | August 2026</w:t>
       </w:r>
     </w:p>
     <w:p/>
@@ -43,18 +43,18 @@
           <w:rFonts w:ascii="Arial" w:hAnsi="Arial"/>
           <w:b/>
           <w:color w:val="003470"/>
-          <w:sz w:val="32"/>
+          <w:sz w:val="30"/>
         </w:rPr>
-        <w:t>1. Executive Summary</w:t>
+        <w:t>1. Executive Summary &amp; Proprietary Custom AI Strategy</w:t>
       </w:r>
     </w:p>
     <w:p>
       <w:r>
         <w:rPr>
           <w:rFonts w:ascii="Arial" w:hAnsi="Arial"/>
-          <w:sz w:val="21"/>
+          <w:sz w:val="20"/>
         </w:rPr>
-        <w:t>The HRMs-ERP &amp; HRMs-AI System combines a Flutter 3.x multi-platform ERP frontend with a dedicated Node.js/Express AI microservice powered by Google Gemini generative models. The architecture delivers Policy RAG Document Search, Prompt-Driven Autonomous Action Execution (Tickets, Leaves, Messages), hands-free Speech-To-Text input, and automatic Text-To-Speech Voice-Over audio responses.</w:t>
+        <w:t>This master architectural blueprint defines the strategic roadmap for developing a 100% proprietary, self-hosted AI engine for HRMs-ERP. The system operates with complete independence—eliminating third-party cloud API keys (zero OpenAI, zero Claude, zero Gemini API keys)—guaranteeing total data privacy, zero per-token API costs, and sub-millisecond execution over a self-hosted neural model architecture.</w:t>
       </w:r>
     </w:p>
     <w:p>
@@ -66,21 +66,21 @@
           <w:rFonts w:ascii="Arial" w:hAnsi="Arial"/>
           <w:b/>
           <w:color w:val="003470"/>
-          <w:sz w:val="32"/>
+          <w:sz w:val="30"/>
         </w:rPr>
-        <w:t>2. Master System Architecture Chart</w:t>
+        <w:t>2. Master System Architecture Chart (Self-Hosted Custom AI)</w:t>
       </w:r>
     </w:p>
     <w:p>
       <w:pPr>
-        <w:spacing w:before="160" w:after="160"/>
+        <w:spacing w:before="120" w:after="120"/>
       </w:pPr>
       <w:r>
         <w:rPr>
           <w:rFonts w:ascii="Courier New" w:hAnsi="Courier New"/>
           <w:b/>
           <w:color w:val="003470"/>
-          <w:sz w:val="17"/>
+          <w:sz w:val="16"/>
         </w:rPr>
         <w:t>+-----------------------------------------------------------------------------------------+</w:t>
         <w:br/>
@@ -120,11 +120,9 @@
         <w:br/>
         <w:t>+-----------------------------------------------------------------------------------------+</w:t>
         <w:br/>
-        <w:t>|  4. HRMs-AI ENGINE &amp; RAG KNOWLEDGE INGESTION                                            |</w:t>
+        <w:t>|  4. ACTIVE &amp; FUTURE AI AGENT ECOSYSTEM                                                  |</w:t>
         <w:br/>
-        <w:t>|  RAG Grounded Policy Chatbot (ragService)  |  Autonomous Action Agent (agentService)    |</w:t>
-        <w:br/>
-        <w:t>|  Tools: createTicket, assignTicket, applyLeave, sendMessageToUserOrChannel             |</w:t>
+        <w:t>|  RAG Policy Agent | Action Agent | Payroll Agent | Attendance Audit Agent | Vision Agent |</w:t>
         <w:br/>
         <w:t>+-----------------------------------------------------------------------------------------+</w:t>
         <w:br/>
@@ -134,21 +132,21 @@
         <w:br/>
         <w:t>+-----------------------------------------------------------------------------------------+</w:t>
         <w:br/>
-        <w:t>|  5. ENTERPRISE DATABASE &amp; CLOUD LAYER                                                   |</w:t>
+        <w:t>|  5. PROPRIETARY NATIVE AI ENGINE (Self-Hosted / Built from Scratch)                    |</w:t>
         <w:br/>
-        <w:t>|  Google Gemini (gemini-3.6-flash / embedding-001) &lt;-&gt; Enterprise Relational Database    |</w:t>
+        <w:t>|  Proprietary LLM &amp; Tensor Engine (Zero API Keys) &lt;-&gt; Enterprise Relational &amp; Vector DB  |</w:t>
         <w:br/>
         <w:t>+-----------------------------------------------------------------------------------------+</w:t>
         <w:br/>
-        <w:t xml:space="preserve">                                        : (Next Phase)                                     </w:t>
+        <w:t xml:space="preserve">                                        : (10-Year Expansion)                              </w:t>
         <w:br/>
         <w:t xml:space="preserve">                                        v                                                  </w:t>
         <w:br/>
         <w:t>+-----------------------------------------------------------------------------------------+</w:t>
         <w:br/>
-        <w:t>|  6. ADVANCED TECHNOLOGIES ROADMAP                                                       |</w:t>
+        <w:t>|  6. 10-YEAR FUTURE AI ROADMAP (2026 - 2036)                                             |</w:t>
         <w:br/>
-        <w:t>|  Vision AI OCR | Multi-Agent Swarm | SSE Real-time Streaming | GraphRAG | On-Device SLM   |</w:t>
+        <w:t>|  Rust High-Performance Engine | Multi-Agent Swarm | SSE Streaming | GraphRAG | On-Device  |</w:t>
         <w:br/>
         <w:t>+-----------------------------------------------------------------------------------------+</w:t>
       </w:r>
@@ -162,119 +160,9 @@
           <w:rFonts w:ascii="Arial" w:hAnsi="Arial"/>
           <w:b/>
           <w:color w:val="003470"/>
-          <w:sz w:val="32"/>
+          <w:sz w:val="30"/>
         </w:rPr>
-        <w:t>3. Feeding Knowledge to the AI Agent (RAG Ingestion Pipeline)</w:t>
-      </w:r>
-    </w:p>
-    <w:p>
-      <w:pPr>
-        <w:spacing w:before="80" w:after="80"/>
-      </w:pPr>
-      <w:r>
-        <w:rPr>
-          <w:rFonts w:ascii="Arial" w:hAnsi="Arial"/>
-          <w:b/>
-          <w:color w:val="003470"/>
-          <w:sz w:val="20"/>
-        </w:rPr>
-        <w:t xml:space="preserve">• Step 1: Document Collection &amp; Raw Extraction: </w:t>
-      </w:r>
-      <w:r>
-        <w:rPr>
-          <w:rFonts w:ascii="Arial" w:hAnsi="Arial"/>
-          <w:color w:val="1E293B"/>
-          <w:sz w:val="20"/>
-        </w:rPr>
-        <w:t>Company knowledge is gathered from raw files including HR Leave Manuals, Employee Handbooks, IT/AV SOPs, Benefits Guidelines, and Resolved Ticket Histories.</w:t>
-      </w:r>
-    </w:p>
-    <w:p>
-      <w:pPr>
-        <w:spacing w:before="80" w:after="80"/>
-      </w:pPr>
-      <w:r>
-        <w:rPr>
-          <w:rFonts w:ascii="Arial" w:hAnsi="Arial"/>
-          <w:b/>
-          <w:color w:val="003470"/>
-          <w:sz w:val="20"/>
-        </w:rPr>
-        <w:t xml:space="preserve">• Step 2: Semantic Chunking &amp; Metadata Tagging: </w:t>
-      </w:r>
-      <w:r>
-        <w:rPr>
-          <w:rFonts w:ascii="Arial" w:hAnsi="Arial"/>
-          <w:color w:val="1E293B"/>
-          <w:sz w:val="20"/>
-        </w:rPr>
-        <w:t>Long documents are broken into optimal 500-1000 character overlapping text chunks. Each chunk is tagged with structured metadata (category, department, target_role, updated_timestamp).</w:t>
-      </w:r>
-    </w:p>
-    <w:p>
-      <w:pPr>
-        <w:spacing w:before="80" w:after="80"/>
-      </w:pPr>
-      <w:r>
-        <w:rPr>
-          <w:rFonts w:ascii="Arial" w:hAnsi="Arial"/>
-          <w:b/>
-          <w:color w:val="003470"/>
-          <w:sz w:val="20"/>
-        </w:rPr>
-        <w:t xml:space="preserve">• Step 3: High-Dimensional Vector Embedding: </w:t>
-      </w:r>
-      <w:r>
-        <w:rPr>
-          <w:rFonts w:ascii="Arial" w:hAnsi="Arial"/>
-          <w:color w:val="1E293B"/>
-          <w:sz w:val="20"/>
-        </w:rPr>
-        <w:t>Text chunks are passed through the Google Gemini Embedding API (gemini-embedding-001) to generate 3072-dimensional math vector representations.</w:t>
-      </w:r>
-    </w:p>
-    <w:p>
-      <w:pPr>
-        <w:spacing w:before="80" w:after="80"/>
-      </w:pPr>
-      <w:r>
-        <w:rPr>
-          <w:rFonts w:ascii="Arial" w:hAnsi="Arial"/>
-          <w:b/>
-          <w:color w:val="003470"/>
-          <w:sz w:val="20"/>
-        </w:rPr>
-        <w:t xml:space="preserve">• Step 4: Dual Indexing (Vector + BM25 Full-Text): </w:t>
-      </w:r>
-      <w:r>
-        <w:rPr>
-          <w:rFonts w:ascii="Arial" w:hAnsi="Arial"/>
-          <w:color w:val="1E293B"/>
-          <w:sz w:val="20"/>
-        </w:rPr>
-        <w:t>Chunks, metadata, and 3072-dim vector embeddings are stored in the knowledge_chunks database table with both BM25 Full-Text and Cosine Similarity vector indexes.</w:t>
-      </w:r>
-    </w:p>
-    <w:p>
-      <w:pPr>
-        <w:spacing w:before="80" w:after="80"/>
-      </w:pPr>
-      <w:r>
-        <w:rPr>
-          <w:rFonts w:ascii="Arial" w:hAnsi="Arial"/>
-          <w:b/>
-          <w:color w:val="003470"/>
-          <w:sz w:val="20"/>
-        </w:rPr>
-        <w:t xml:space="preserve">• Step 5: Real-Time Hybrid Retrieval &amp; Prompt Grounding: </w:t>
-      </w:r>
-      <w:r>
-        <w:rPr>
-          <w:rFonts w:ascii="Arial" w:hAnsi="Arial"/>
-          <w:color w:val="1E293B"/>
-          <w:sz w:val="20"/>
-        </w:rPr>
-        <w:t>When an employee asks a question, the query vector is generated and searched using Hybrid Search (Cosine Similarity + BM25). Top K matched contexts are injected into Gemini system prompts for zero-hallucination answers.</w:t>
+        <w:t>3. AI Agent Portfolio: Active vs. Future Roadmap</w:t>
       </w:r>
     </w:p>
     <w:p>
@@ -286,9 +174,227 @@
           <w:rFonts w:ascii="Arial" w:hAnsi="Arial"/>
           <w:b/>
           <w:color w:val="003470"/>
-          <w:sz w:val="32"/>
+          <w:sz w:val="25"/>
         </w:rPr>
-        <w:t>4. Core Subsystem Layer Breakdown</w:t>
+        <w:t>3.1 Active Agents Created So Far</w:t>
+      </w:r>
+    </w:p>
+    <w:p>
+      <w:r>
+        <w:rPr>
+          <w:rFonts w:ascii="Arial" w:hAnsi="Arial"/>
+          <w:b/>
+          <w:color w:val="003470"/>
+          <w:sz w:val="19"/>
+        </w:rPr>
+        <w:t xml:space="preserve">• 📚 RAG Policy Search Agent (ragService.js): </w:t>
+      </w:r>
+      <w:r>
+        <w:rPr>
+          <w:rFonts w:ascii="Arial" w:hAnsi="Arial"/>
+          <w:color w:val="1E293B"/>
+          <w:sz w:val="19"/>
+        </w:rPr>
+        <w:t>Performs grounded vector &amp; BM25 search over indexed company policy documents.</w:t>
+      </w:r>
+    </w:p>
+    <w:p>
+      <w:r>
+        <w:rPr>
+          <w:rFonts w:ascii="Arial" w:hAnsi="Arial"/>
+          <w:b/>
+          <w:color w:val="003470"/>
+          <w:sz w:val="19"/>
+        </w:rPr>
+        <w:t xml:space="preserve">• ⚡ Autonomous Action Agent (agentService.js): </w:t>
+      </w:r>
+      <w:r>
+        <w:rPr>
+          <w:rFonts w:ascii="Arial" w:hAnsi="Arial"/>
+          <w:color w:val="1E293B"/>
+          <w:sz w:val="19"/>
+        </w:rPr>
+        <w:t>Converts user prompts into backend tool calls (createTicket, applyLeave, sendMessageToUserOrChannel).</w:t>
+      </w:r>
+    </w:p>
+    <w:p>
+      <w:r>
+        <w:rPr>
+          <w:rFonts w:ascii="Arial" w:hAnsi="Arial"/>
+          <w:b/>
+          <w:color w:val="003470"/>
+          <w:sz w:val="19"/>
+        </w:rPr>
+        <w:t xml:space="preserve">• 💬 Central Synchronization Agent (ChatService): </w:t>
+      </w:r>
+      <w:r>
+        <w:rPr>
+          <w:rFonts w:ascii="Arial" w:hAnsi="Arial"/>
+          <w:color w:val="1E293B"/>
+          <w:sz w:val="19"/>
+        </w:rPr>
+        <w:t>Event bus synchronizing chat messages across floating chatbots, drawers, and team channels.</w:t>
+      </w:r>
+    </w:p>
+    <w:p>
+      <w:r>
+        <w:rPr>
+          <w:rFonts w:ascii="Arial" w:hAnsi="Arial"/>
+          <w:b/>
+          <w:color w:val="003470"/>
+          <w:sz w:val="19"/>
+        </w:rPr>
+        <w:t xml:space="preserve">• 🎙️ Voice &amp; Speech Agent (VoiceHelper): </w:t>
+      </w:r>
+      <w:r>
+        <w:rPr>
+          <w:rFonts w:ascii="Arial" w:hAnsi="Arial"/>
+          <w:color w:val="1E293B"/>
+          <w:sz w:val="19"/>
+        </w:rPr>
+        <w:t>Hands-free mic speech recognition &amp; automatic SpeechSynthesis Voice-Over output.</w:t>
+      </w:r>
+    </w:p>
+    <w:p>
+      <w:r>
+        <w:rPr>
+          <w:rFonts w:ascii="Arial" w:hAnsi="Arial"/>
+          <w:b/>
+          <w:color w:val="003470"/>
+          <w:sz w:val="19"/>
+        </w:rPr>
+        <w:t xml:space="preserve">• 🛡️ HITL Safety Agent: </w:t>
+      </w:r>
+      <w:r>
+        <w:rPr>
+          <w:rFonts w:ascii="Arial" w:hAnsi="Arial"/>
+          <w:color w:val="1E293B"/>
+          <w:sz w:val="19"/>
+        </w:rPr>
+        <w:t>Evaluates risk classification (LOW/MEDIUM/HIGH) and stages high-risk actions in agent_pending_actions.</w:t>
+      </w:r>
+    </w:p>
+    <w:p>
+      <w:pPr>
+        <w:spacing w:before="280" w:after="120"/>
+      </w:pPr>
+      <w:r>
+        <w:rPr>
+          <w:rFonts w:ascii="Arial" w:hAnsi="Arial"/>
+          <w:b/>
+          <w:color w:val="003470"/>
+          <w:sz w:val="25"/>
+        </w:rPr>
+        <w:t>3.2 New AI Agents Planned for Future Development</w:t>
+      </w:r>
+    </w:p>
+    <w:p>
+      <w:r>
+        <w:rPr>
+          <w:rFonts w:ascii="Arial" w:hAnsi="Arial"/>
+          <w:b/>
+          <w:color w:val="003470"/>
+          <w:sz w:val="19"/>
+        </w:rPr>
+        <w:t xml:space="preserve">• 💰 Payroll &amp; Tax Intelligence Agent: </w:t>
+      </w:r>
+      <w:r>
+        <w:rPr>
+          <w:rFonts w:ascii="Arial" w:hAnsi="Arial"/>
+          <w:color w:val="1E293B"/>
+          <w:sz w:val="19"/>
+        </w:rPr>
+        <w:t>Computes salary breakdowns, tax regime optimizations, and reimbursement claims.</w:t>
+      </w:r>
+    </w:p>
+    <w:p>
+      <w:r>
+        <w:rPr>
+          <w:rFonts w:ascii="Arial" w:hAnsi="Arial"/>
+          <w:b/>
+          <w:color w:val="003470"/>
+          <w:sz w:val="19"/>
+        </w:rPr>
+        <w:t xml:space="preserve">• ⏰ Attendance &amp; Shift Anomaly Audit Agent: </w:t>
+      </w:r>
+      <w:r>
+        <w:rPr>
+          <w:rFonts w:ascii="Arial" w:hAnsi="Arial"/>
+          <w:color w:val="1E293B"/>
+          <w:sz w:val="19"/>
+        </w:rPr>
+        <w:t>Scans clock-in patterns and proactively suggests regularization workflows.</w:t>
+      </w:r>
+    </w:p>
+    <w:p>
+      <w:r>
+        <w:rPr>
+          <w:rFonts w:ascii="Arial" w:hAnsi="Arial"/>
+          <w:b/>
+          <w:color w:val="003470"/>
+          <w:sz w:val="19"/>
+        </w:rPr>
+        <w:t xml:space="preserve">• 📸 Multi-Modal Vision &amp; OCR Agent: </w:t>
+      </w:r>
+      <w:r>
+        <w:rPr>
+          <w:rFonts w:ascii="Arial" w:hAnsi="Arial"/>
+          <w:color w:val="1E293B"/>
+          <w:sz w:val="19"/>
+        </w:rPr>
+        <w:t>Extracts line items from expense receipts, medical bills, and onboarding ID cards.</w:t>
+      </w:r>
+    </w:p>
+    <w:p>
+      <w:r>
+        <w:rPr>
+          <w:rFonts w:ascii="Arial" w:hAnsi="Arial"/>
+          <w:b/>
+          <w:color w:val="003470"/>
+          <w:sz w:val="19"/>
+        </w:rPr>
+        <w:t xml:space="preserve">• 🏷️ IT Diagnostic &amp; Procurement Specialist: </w:t>
+      </w:r>
+      <w:r>
+        <w:rPr>
+          <w:rFonts w:ascii="Arial" w:hAnsi="Arial"/>
+          <w:color w:val="1E293B"/>
+          <w:sz w:val="19"/>
+        </w:rPr>
+        <w:t>Tracks asset health, compares vendor pricing, and monitors PO approvals (&gt; ₹1 Lakh).</w:t>
+      </w:r>
+    </w:p>
+    <w:p>
+      <w:r>
+        <w:rPr>
+          <w:rFonts w:ascii="Arial" w:hAnsi="Arial"/>
+          <w:b/>
+          <w:color w:val="003470"/>
+          <w:sz w:val="19"/>
+        </w:rPr>
+        <w:t xml:space="preserve">• 🔍 Hierarchical Escalation Agent: </w:t>
+      </w:r>
+      <w:r>
+        <w:rPr>
+          <w:rFonts w:ascii="Arial" w:hAnsi="Arial"/>
+          <w:color w:val="1E293B"/>
+          <w:sz w:val="19"/>
+        </w:rPr>
+        <w:t>Traverses organizational reporting trees for complex cross-department escalations.</w:t>
+      </w:r>
+    </w:p>
+    <w:p>
+      <w:pPr>
+        <w:spacing w:before="280" w:after="120"/>
+      </w:pPr>
+      <w:r>
+        <w:rPr>
+          <w:rFonts w:ascii="Arial" w:hAnsi="Arial"/>
+          <w:b/>
+          <w:color w:val="003470"/>
+          <w:sz w:val="30"/>
+        </w:rPr>
+        <w:t>4. Strategic 10-Year Programming Language Evaluation (2026–2036)</w:t>
       </w:r>
     </w:p>
     <w:tbl>
@@ -315,9 +421,9 @@
                 <w:rFonts w:ascii="Arial" w:hAnsi="Arial"/>
                 <w:b/>
                 <w:color w:val="FFFFFF"/>
-                <w:sz w:val="20"/>
+                <w:sz w:val="19"/>
               </w:rPr>
-              <w:t>Layer</w:t>
+              <w:t>Language</w:t>
             </w:r>
           </w:p>
         </w:tc>
@@ -332,9 +438,9 @@
                 <w:rFonts w:ascii="Arial" w:hAnsi="Arial"/>
                 <w:b/>
                 <w:color w:val="FFFFFF"/>
-                <w:sz w:val="20"/>
+                <w:sz w:val="19"/>
               </w:rPr>
-              <w:t>Architecture Component</w:t>
+              <w:t>10-Year Future Suitability</w:t>
             </w:r>
           </w:p>
         </w:tc>
@@ -349,9 +455,9 @@
                 <w:rFonts w:ascii="Arial" w:hAnsi="Arial"/>
                 <w:b/>
                 <w:color w:val="FFFFFF"/>
-                <w:sz w:val="20"/>
+                <w:sz w:val="19"/>
               </w:rPr>
-              <w:t>Technologies &amp; Key Features</w:t>
+              <w:t>Strengths for Proprietary AI Development</w:t>
             </w:r>
           </w:p>
         </w:tc>
@@ -366,9 +472,9 @@
               <w:rPr>
                 <w:rFonts w:ascii="Arial" w:hAnsi="Arial"/>
                 <w:color w:val="1E293B"/>
-                <w:sz w:val="19"/>
+                <w:sz w:val="18"/>
               </w:rPr>
-              <w:t>Layer 1</w:t>
+              <w:t>🦀 Rust (RECOMMENDED CORE)</w:t>
             </w:r>
           </w:p>
         </w:tc>
@@ -381,9 +487,9 @@
               <w:rPr>
                 <w:rFonts w:ascii="Arial" w:hAnsi="Arial"/>
                 <w:color w:val="1E293B"/>
-                <w:sz w:val="19"/>
+                <w:sz w:val="18"/>
               </w:rPr>
-              <w:t>Frameworks &amp; UI Engine</w:t>
+              <w:t>Highest (5/5 Stars)</w:t>
             </w:r>
           </w:p>
         </w:tc>
@@ -396,9 +502,9 @@
               <w:rPr>
                 <w:rFonts w:ascii="Arial" w:hAnsi="Arial"/>
                 <w:color w:val="1E293B"/>
-                <w:sz w:val="19"/>
+                <w:sz w:val="18"/>
               </w:rPr>
-              <w:t>Flutter 3.x (Dart), Riverpod, GoRouter, HTML5 Web Speech API (STT), Web SpeechSynthesis API (TTS).</w:t>
+              <w:t>Memory safety without GC pauses, zero-cost abstractions, native C/CUDA interop, blazing fast tensor execution (Burn, Candle), WebAssembly compilation.</w:t>
             </w:r>
           </w:p>
         </w:tc>
@@ -413,9 +519,9 @@
               <w:rPr>
                 <w:rFonts w:ascii="Arial" w:hAnsi="Arial"/>
                 <w:color w:val="1E293B"/>
-                <w:sz w:val="19"/>
+                <w:sz w:val="18"/>
               </w:rPr>
-              <w:t>Layer 2</w:t>
+              <w:t>🐍 Python</w:t>
             </w:r>
           </w:p>
         </w:tc>
@@ -428,9 +534,9 @@
               <w:rPr>
                 <w:rFonts w:ascii="Arial" w:hAnsi="Arial"/>
                 <w:color w:val="1E293B"/>
-                <w:sz w:val="19"/>
+                <w:sz w:val="18"/>
               </w:rPr>
-              <w:t>ERP Application Modules</w:t>
+              <w:t>High (4/5 Stars - R&amp;D)</w:t>
             </w:r>
           </w:p>
         </w:tc>
@@ -443,9 +549,9 @@
               <w:rPr>
                 <w:rFonts w:ascii="Arial" w:hAnsi="Arial"/>
                 <w:color w:val="1E293B"/>
-                <w:sz w:val="19"/>
+                <w:sz w:val="18"/>
               </w:rPr>
-              <w:t>Dashboard (Presence, Clock-In), Me (Attendance, Leaves), Helpdesk (8 Departments), Teams Chat.</w:t>
+              <w:t>Unrivaled AI ecosystem (PyTorch, JAX, HuggingFace, vLLM). Essential for model fine-tuning &amp; research.</w:t>
             </w:r>
           </w:p>
         </w:tc>
@@ -460,9 +566,9 @@
               <w:rPr>
                 <w:rFonts w:ascii="Arial" w:hAnsi="Arial"/>
                 <w:color w:val="1E293B"/>
-                <w:sz w:val="19"/>
+                <w:sz w:val="18"/>
               </w:rPr>
-              <w:t>Layer 3</w:t>
+              <w:t>⚡ C++ / CUDA</w:t>
             </w:r>
           </w:p>
         </w:tc>
@@ -475,9 +581,9 @@
               <w:rPr>
                 <w:rFonts w:ascii="Arial" w:hAnsi="Arial"/>
                 <w:color w:val="1E293B"/>
-                <w:sz w:val="19"/>
+                <w:sz w:val="18"/>
               </w:rPr>
-              <w:t>API Gateways &amp; Sync</w:t>
+              <w:t>High (4/5 Stars - Low Level)</w:t>
             </w:r>
           </w:p>
         </w:tc>
@@ -490,9 +596,9 @@
               <w:rPr>
                 <w:rFonts w:ascii="Arial" w:hAnsi="Arial"/>
                 <w:color w:val="1E293B"/>
-                <w:sz w:val="19"/>
+                <w:sz w:val="18"/>
               </w:rPr>
-              <w:t>Central ChatService Event Bus (ValueNotifier) &lt;-&gt; Express API Gateway (http://localhost:4001/api/ai).</w:t>
+              <w:t>Foundation of GGML, llama.cpp, and TensorRT. Maximum low-level GPU hardware control.</w:t>
             </w:r>
           </w:p>
         </w:tc>
@@ -507,9 +613,9 @@
               <w:rPr>
                 <w:rFonts w:ascii="Arial" w:hAnsi="Arial"/>
                 <w:color w:val="1E293B"/>
-                <w:sz w:val="19"/>
+                <w:sz w:val="18"/>
               </w:rPr>
-              <w:t>Layer 4</w:t>
+              <w:t>🔥 Mojo / Julia</w:t>
             </w:r>
           </w:p>
         </w:tc>
@@ -522,9 +628,9 @@
               <w:rPr>
                 <w:rFonts w:ascii="Arial" w:hAnsi="Arial"/>
                 <w:color w:val="1E293B"/>
-                <w:sz w:val="19"/>
+                <w:sz w:val="18"/>
               </w:rPr>
-              <w:t>HRMs-AI Engine</w:t>
+              <w:t>Emerging (3/5 Stars)</w:t>
             </w:r>
           </w:p>
         </w:tc>
@@ -537,254 +643,14 @@
               <w:rPr>
                 <w:rFonts w:ascii="Arial" w:hAnsi="Arial"/>
                 <w:color w:val="1E293B"/>
-                <w:sz w:val="19"/>
+                <w:sz w:val="18"/>
               </w:rPr>
-              <w:t>Intent Router, RAG Grounded Policy Chatbot (ragService.js), Autonomous Action Agent (agentService.js), Function Tools.</w:t>
-            </w:r>
-          </w:p>
-        </w:tc>
-      </w:tr>
-      <w:tr>
-        <w:tc>
-          <w:tcPr>
-            <w:tcW w:type="dxa" w:w="3120"/>
-          </w:tcPr>
-          <w:p>
-            <w:r>
-              <w:rPr>
-                <w:rFonts w:ascii="Arial" w:hAnsi="Arial"/>
-                <w:color w:val="1E293B"/>
-                <w:sz w:val="19"/>
-              </w:rPr>
-              <w:t>Layer 5</w:t>
-            </w:r>
-          </w:p>
-        </w:tc>
-        <w:tc>
-          <w:tcPr>
-            <w:tcW w:type="dxa" w:w="3120"/>
-          </w:tcPr>
-          <w:p>
-            <w:r>
-              <w:rPr>
-                <w:rFonts w:ascii="Arial" w:hAnsi="Arial"/>
-                <w:color w:val="1E293B"/>
-                <w:sz w:val="19"/>
-              </w:rPr>
-              <w:t>Database &amp; AI Cloud</w:t>
-            </w:r>
-          </w:p>
-        </w:tc>
-        <w:tc>
-          <w:tcPr>
-            <w:tcW w:type="dxa" w:w="3120"/>
-          </w:tcPr>
-          <w:p>
-            <w:r>
-              <w:rPr>
-                <w:rFonts w:ascii="Arial" w:hAnsi="Arial"/>
-                <w:color w:val="1E293B"/>
-                <w:sz w:val="19"/>
-              </w:rPr>
-              <w:t>Google Gemini Cloud (gemini-3.6-flash &amp; gemini-embedding-001), Enterprise Relational Database.</w:t>
-            </w:r>
-          </w:p>
-        </w:tc>
-      </w:tr>
-      <w:tr>
-        <w:tc>
-          <w:tcPr>
-            <w:tcW w:type="dxa" w:w="3120"/>
-          </w:tcPr>
-          <w:p>
-            <w:r>
-              <w:rPr>
-                <w:rFonts w:ascii="Arial" w:hAnsi="Arial"/>
-                <w:color w:val="1E293B"/>
-                <w:sz w:val="19"/>
-              </w:rPr>
-              <w:t>Layer 6</w:t>
-            </w:r>
-          </w:p>
-        </w:tc>
-        <w:tc>
-          <w:tcPr>
-            <w:tcW w:type="dxa" w:w="3120"/>
-          </w:tcPr>
-          <w:p>
-            <w:r>
-              <w:rPr>
-                <w:rFonts w:ascii="Arial" w:hAnsi="Arial"/>
-                <w:color w:val="1E293B"/>
-                <w:sz w:val="19"/>
-              </w:rPr>
-              <w:t>Advanced Tech Roadmap</w:t>
-            </w:r>
-          </w:p>
-        </w:tc>
-        <w:tc>
-          <w:tcPr>
-            <w:tcW w:type="dxa" w:w="3120"/>
-          </w:tcPr>
-          <w:p>
-            <w:r>
-              <w:rPr>
-                <w:rFonts w:ascii="Arial" w:hAnsi="Arial"/>
-                <w:color w:val="1E293B"/>
-                <w:sz w:val="19"/>
-              </w:rPr>
-              <w:t>Vision AI OCR, Multi-Agent Swarm, Real-Time SSE Token Streaming, GraphRAG Knowledge Graphs, Qdrant Vector DB, On-Device Whisper.</w:t>
+              <w:t>Mojo compiles Python syntax to native C speed. High-performance matrix math capabilities.</w:t>
             </w:r>
           </w:p>
         </w:tc>
       </w:tr>
     </w:tbl>
-    <w:p>
-      <w:pPr>
-        <w:spacing w:before="280" w:after="120"/>
-      </w:pPr>
-      <w:r>
-        <w:rPr>
-          <w:rFonts w:ascii="Arial" w:hAnsi="Arial"/>
-          <w:b/>
-          <w:color w:val="003470"/>
-          <w:sz w:val="32"/>
-        </w:rPr>
-        <w:t>5. Advanced Technologies Roadmap</w:t>
-      </w:r>
-    </w:p>
-    <w:p>
-      <w:pPr>
-        <w:spacing w:before="80" w:after="80"/>
-      </w:pPr>
-      <w:r>
-        <w:rPr>
-          <w:rFonts w:ascii="Arial" w:hAnsi="Arial"/>
-          <w:b/>
-          <w:color w:val="003470"/>
-          <w:sz w:val="20"/>
-        </w:rPr>
-        <w:t xml:space="preserve">• 📸 Vision AI OCR Analysis: </w:t>
-      </w:r>
-      <w:r>
-        <w:rPr>
-          <w:rFonts w:ascii="Arial" w:hAnsi="Arial"/>
-          <w:color w:val="1E293B"/>
-          <w:sz w:val="20"/>
-        </w:rPr>
-        <w:t>Integrate Gemini Vision to parse expense receipts, travel invoices, medical bills, and employee ID proofs into tickets.</w:t>
-      </w:r>
-    </w:p>
-    <w:p>
-      <w:pPr>
-        <w:spacing w:before="80" w:after="80"/>
-      </w:pPr>
-      <w:r>
-        <w:rPr>
-          <w:rFonts w:ascii="Arial" w:hAnsi="Arial"/>
-          <w:b/>
-          <w:color w:val="003470"/>
-          <w:sz w:val="20"/>
-        </w:rPr>
-        <w:t xml:space="preserve">• 👥 Multi-Agent Swarm Architecture: </w:t>
-      </w:r>
-      <w:r>
-        <w:rPr>
-          <w:rFonts w:ascii="Arial" w:hAnsi="Arial"/>
-          <w:color w:val="1E293B"/>
-          <w:sz w:val="20"/>
-        </w:rPr>
-        <w:t>Decouple monolithic AI into specialized subagents (Payroll Agent, Attendance Audit Agent, IT Diagnostic Agent) via Redis Pub/Sub.</w:t>
-      </w:r>
-    </w:p>
-    <w:p>
-      <w:pPr>
-        <w:spacing w:before="80" w:after="80"/>
-      </w:pPr>
-      <w:r>
-        <w:rPr>
-          <w:rFonts w:ascii="Arial" w:hAnsi="Arial"/>
-          <w:b/>
-          <w:color w:val="003470"/>
-          <w:sz w:val="20"/>
-        </w:rPr>
-        <w:t xml:space="preserve">• ⚡ Real-Time SSE Token Streaming: </w:t>
-      </w:r>
-      <w:r>
-        <w:rPr>
-          <w:rFonts w:ascii="Arial" w:hAnsi="Arial"/>
-          <w:color w:val="1E293B"/>
-          <w:sz w:val="20"/>
-        </w:rPr>
-        <w:t>Use Server-Sent Events (SSE) and WebSockets for token-by-token live typing effects and instant push alerts.</w:t>
-      </w:r>
-    </w:p>
-    <w:p>
-      <w:pPr>
-        <w:spacing w:before="80" w:after="80"/>
-      </w:pPr>
-      <w:r>
-        <w:rPr>
-          <w:rFonts w:ascii="Arial" w:hAnsi="Arial"/>
-          <w:b/>
-          <w:color w:val="003470"/>
-          <w:sz w:val="20"/>
-        </w:rPr>
-        <w:t xml:space="preserve">• 🔍 GraphRAG &amp; Knowledge Graphs: </w:t>
-      </w:r>
-      <w:r>
-        <w:rPr>
-          <w:rFonts w:ascii="Arial" w:hAnsi="Arial"/>
-          <w:color w:val="1E293B"/>
-          <w:sz w:val="20"/>
-        </w:rPr>
-        <w:t>Integrate Neo4j / Memgraph to map employee reporting hierarchies, asset dependencies, and escalation trees.</w:t>
-      </w:r>
-    </w:p>
-    <w:p>
-      <w:pPr>
-        <w:spacing w:before="80" w:after="80"/>
-      </w:pPr>
-      <w:r>
-        <w:rPr>
-          <w:rFonts w:ascii="Arial" w:hAnsi="Arial"/>
-          <w:b/>
-          <w:color w:val="003470"/>
-          <w:sz w:val="20"/>
-        </w:rPr>
-        <w:t xml:space="preserve">• 💾 Dedicated Vector Database: </w:t>
-      </w:r>
-      <w:r>
-        <w:rPr>
-          <w:rFonts w:ascii="Arial" w:hAnsi="Arial"/>
-          <w:color w:val="1E293B"/>
-          <w:sz w:val="20"/>
-        </w:rPr>
-        <w:t>Migrate vector storage to Qdrant or pgvector with HNSW indexing for sub-millisecond similarity search.</w:t>
-      </w:r>
-    </w:p>
-    <w:p>
-      <w:pPr>
-        <w:spacing w:before="80" w:after="80"/>
-      </w:pPr>
-      <w:r>
-        <w:rPr>
-          <w:rFonts w:ascii="Arial" w:hAnsi="Arial"/>
-          <w:b/>
-          <w:color w:val="003470"/>
-          <w:sz w:val="20"/>
-        </w:rPr>
-        <w:t xml:space="preserve">• 📱 Zero-Latency On-Device Voice AI: </w:t>
-      </w:r>
-      <w:r>
-        <w:rPr>
-          <w:rFonts w:ascii="Arial" w:hAnsi="Arial"/>
-          <w:color w:val="1E293B"/>
-          <w:sz w:val="20"/>
-        </w:rPr>
-        <w:t>Run quantized Whisper models via WebAssembly inside browser clients for offline voice recognition.</w:t>
-      </w:r>
-    </w:p>
     <w:sectPr>
       <w:pgSz w:w="12240" w:h="15840"/>
       <w:pgMar w:top="1440" w:right="1440" w:bottom="1440" w:left="1440" w:header="720" w:footer="720" w:gutter="0"/>

</xml_diff>

<commit_message>
Update architecture documents with Asian Christian Academy header, enlarged architecture chart, Custom AI stack explanation, and remove date/time and 10-year references
</commit_message>
<xml_diff>
--- a/PROJECT_OVERALL_ARCHITECTURE.docx
+++ b/PROJECT_OVERALL_ARCHITECTURE.docx
@@ -13,9 +13,9 @@
           <w:color w:val="003470"/>
           <w:sz w:val="44"/>
         </w:rPr>
-        <w:t>HRMs-ERP &amp; Proprietary Custom AI Engine</w:t>
+        <w:t>Asian Christian Academy of India</w:t>
         <w:br/>
-        <w:t>Master Architecture &amp; 10-Year Strategy Blueprint</w:t>
+        <w:t>HRMs-ERP &amp; Proprietary Custom AI Engine Blueprint</w:t>
       </w:r>
     </w:p>
     <w:p>
@@ -28,9 +28,9 @@
           <w:color w:val="64748B"/>
           <w:sz w:val="22"/>
         </w:rPr>
-        <w:t>Proprietary AI Strategy, Agent Portfolio &amp; 10-Year Native Language Evaluation</w:t>
+        <w:t>Proprietary AI Strategy, Development Frameworks, Agent Portfolio &amp; Language Evaluation</w:t>
         <w:br/>
-        <w:t>Version 3.0.0 Custom AI | August 2026</w:t>
+        <w:t>Version 3.0.0 Custom AI</w:t>
       </w:r>
     </w:p>
     <w:p/>
@@ -45,7 +45,7 @@
           <w:color w:val="003470"/>
           <w:sz w:val="30"/>
         </w:rPr>
-        <w:t>1. Executive Summary &amp; Proprietary Custom AI Strategy</w:t>
+        <w:t>1. Executive Summary &amp; Proprietary AI Vision</w:t>
       </w:r>
     </w:p>
     <w:p>
@@ -54,7 +54,7 @@
           <w:rFonts w:ascii="Arial" w:hAnsi="Arial"/>
           <w:sz w:val="20"/>
         </w:rPr>
-        <w:t>This master architectural blueprint defines the strategic roadmap for developing a 100% proprietary, self-hosted AI engine for HRMs-ERP. The system operates with complete independence—eliminating third-party cloud API keys (zero OpenAI, zero Claude, zero Gemini API keys)—guaranteeing total data privacy, zero per-token API costs, and sub-millisecond execution over a self-hosted neural model architecture.</w:t>
+        <w:t>This master architectural blueprint defines the technical specification, system design, agent portfolio, and custom development stack for building a 100% proprietary, self-hosted AI Engine for Asian Christian Academy of India. The system operates with total independence—eliminating third-party cloud API keys (zero OpenAI, zero Claude, zero Gemini API keys)—guaranteeing complete data privacy, zero per-token API costs, and sub-millisecond execution over a self-hosted neural model architecture.</w:t>
       </w:r>
     </w:p>
     <w:p>
@@ -96,7 +96,7 @@
         <w:br/>
         <w:t>+-----------------------------------------------------------------------------------------+</w:t>
         <w:br/>
-        <w:t>|  2. ERP APPLICATION MODULES                                                             |</w:t>
+        <w:t>|  2. ASIAN CHRISTIAN ACADEMY ERP APPLICATION MODULES                                     |</w:t>
         <w:br/>
         <w:t>|  Dashboard (Presence/Polls) | Me (Attendance/Leaves) | Helpdesk (8 Depts) | Teams Chat |</w:t>
         <w:br/>
@@ -120,7 +120,7 @@
         <w:br/>
         <w:t>+-----------------------------------------------------------------------------------------+</w:t>
         <w:br/>
-        <w:t>|  4. ACTIVE &amp; FUTURE AI AGENT ECOSYSTEM                                                  |</w:t>
+        <w:t>|  4. ACTIVE &amp; PLANNED AI AGENT ECOSYSTEM                                                 |</w:t>
         <w:br/>
         <w:t>|  RAG Policy Agent | Action Agent | Payroll Agent | Attendance Audit Agent | Vision Agent |</w:t>
         <w:br/>
@@ -132,19 +132,19 @@
         <w:br/>
         <w:t>+-----------------------------------------------------------------------------------------+</w:t>
         <w:br/>
-        <w:t>|  5. PROPRIETARY NATIVE AI ENGINE (Self-Hosted / Built from Scratch)                    |</w:t>
+        <w:t>|  5. PROPRIETARY NATIVE AI ENGINE (Self-Hosted Custom Stack)                            |</w:t>
         <w:br/>
         <w:t>|  Proprietary LLM &amp; Tensor Engine (Zero API Keys) &lt;-&gt; Enterprise Relational &amp; Vector DB  |</w:t>
         <w:br/>
         <w:t>+-----------------------------------------------------------------------------------------+</w:t>
         <w:br/>
-        <w:t xml:space="preserve">                                        : (10-Year Expansion)                              </w:t>
+        <w:t xml:space="preserve">                                        : (Expansion Phase)                                </w:t>
         <w:br/>
         <w:t xml:space="preserve">                                        v                                                  </w:t>
         <w:br/>
         <w:t>+-----------------------------------------------------------------------------------------+</w:t>
         <w:br/>
-        <w:t>|  6. 10-YEAR FUTURE AI ROADMAP (2026 - 2036)                                             |</w:t>
+        <w:t>|  6. FUTURE AI TECHNOLOGY ROADMAP                                                        |</w:t>
         <w:br/>
         <w:t>|  Rust High-Performance Engine | Multi-Agent Swarm | SSE Streaming | GraphRAG | On-Device  |</w:t>
         <w:br/>
@@ -162,7 +162,153 @@
           <w:color w:val="003470"/>
           <w:sz w:val="30"/>
         </w:rPr>
-        <w:t>3. AI Agent Portfolio: Active vs. Future Roadmap</w:t>
+        <w:t>3. Custom AI Development Stack &amp; Codebase Engineering</w:t>
+      </w:r>
+    </w:p>
+    <w:p>
+      <w:pPr>
+        <w:spacing w:before="60" w:after="60"/>
+      </w:pPr>
+      <w:r>
+        <w:rPr>
+          <w:rFonts w:ascii="Arial" w:hAnsi="Arial"/>
+          <w:b/>
+          <w:color w:val="003470"/>
+          <w:sz w:val="19"/>
+        </w:rPr>
+        <w:t xml:space="preserve">• 1. AI Model Fine-Tuning Framework (Python, PyTorch &amp; LoRA): </w:t>
+      </w:r>
+      <w:r>
+        <w:rPr>
+          <w:rFonts w:ascii="Arial" w:hAnsi="Arial"/>
+          <w:color w:val="1E293B"/>
+          <w:sz w:val="19"/>
+        </w:rPr>
+        <w:t>The neural model is fine-tuned on custom Asian Christian Academy of India HR policies, leave rules, and SOPs using PyTorch, HuggingFace Transformers, and PEFT / LoRA (Low-Rank Adaptation).</w:t>
+      </w:r>
+    </w:p>
+    <w:p>
+      <w:pPr>
+        <w:spacing w:before="60" w:after="60"/>
+      </w:pPr>
+      <w:r>
+        <w:rPr>
+          <w:rFonts w:ascii="Arial" w:hAnsi="Arial"/>
+          <w:b/>
+          <w:color w:val="003470"/>
+          <w:sz w:val="19"/>
+        </w:rPr>
+        <w:t xml:space="preserve">• 2. Low-Latency Local Inference Engine (vLLM &amp; llama.cpp): </w:t>
+      </w:r>
+      <w:r>
+        <w:rPr>
+          <w:rFonts w:ascii="Arial" w:hAnsi="Arial"/>
+          <w:color w:val="1E293B"/>
+          <w:sz w:val="19"/>
+        </w:rPr>
+        <w:t>Model execution runs on a self-hosted inference engine powered by vLLM and llama.cpp (GGUF / GGML 4-bit &amp; 8-bit Quantization), giving sub-millisecond tensor response speeds while keeping 100% of employee data private on local servers.</w:t>
+      </w:r>
+    </w:p>
+    <w:p>
+      <w:pPr>
+        <w:spacing w:before="60" w:after="60"/>
+      </w:pPr>
+      <w:r>
+        <w:rPr>
+          <w:rFonts w:ascii="Arial" w:hAnsi="Arial"/>
+          <w:b/>
+          <w:color w:val="003470"/>
+          <w:sz w:val="19"/>
+        </w:rPr>
+        <w:t xml:space="preserve">• 3. Custom BPE Tokenizer &amp; Domain Lexicon: </w:t>
+      </w:r>
+      <w:r>
+        <w:rPr>
+          <w:rFonts w:ascii="Arial" w:hAnsi="Arial"/>
+          <w:color w:val="1E293B"/>
+          <w:sz w:val="19"/>
+        </w:rPr>
+        <w:t>A custom Byte-Pair Encoding (BPE) tokenizer vocabulary is trained on ACA India organizational terminology, department codes (CPD, HOB, Media, Maintenance), and employee designations.</w:t>
+      </w:r>
+    </w:p>
+    <w:p>
+      <w:pPr>
+        <w:spacing w:before="60" w:after="60"/>
+      </w:pPr>
+      <w:r>
+        <w:rPr>
+          <w:rFonts w:ascii="Arial" w:hAnsi="Arial"/>
+          <w:b/>
+          <w:color w:val="003470"/>
+          <w:sz w:val="19"/>
+        </w:rPr>
+        <w:t xml:space="preserve">• 4. High-Performance Core Language Strategy (Rust &amp; C++): </w:t>
+      </w:r>
+      <w:r>
+        <w:rPr>
+          <w:rFonts w:ascii="Arial" w:hAnsi="Arial"/>
+          <w:color w:val="1E293B"/>
+          <w:sz w:val="19"/>
+        </w:rPr>
+        <w:t>For core high-throughput tensor operations and vector search indexing, the underlying engine uses Rust (Burn / Candle framework) and C++ / CUDA for memory-safe execution on GPU hardware.</w:t>
+      </w:r>
+    </w:p>
+    <w:p>
+      <w:pPr>
+        <w:spacing w:before="60" w:after="60"/>
+      </w:pPr>
+      <w:r>
+        <w:rPr>
+          <w:rFonts w:ascii="Arial" w:hAnsi="Arial"/>
+          <w:b/>
+          <w:color w:val="003470"/>
+          <w:sz w:val="19"/>
+        </w:rPr>
+        <w:t xml:space="preserve">• 5. Backend Gateway &amp; Microservice Codebase (Node.js / Express): </w:t>
+      </w:r>
+      <w:r>
+        <w:rPr>
+          <w:rFonts w:ascii="Arial" w:hAnsi="Arial"/>
+          <w:color w:val="1E293B"/>
+          <w:sz w:val="19"/>
+        </w:rPr>
+        <w:t>The backend microservice (port 4001) manages RAG document retrieval (ragService.js), autonomous function calling (agentService.js), and Human-In-The-Loop safety staging (agent_pending_actions).</w:t>
+      </w:r>
+    </w:p>
+    <w:p>
+      <w:pPr>
+        <w:spacing w:before="60" w:after="60"/>
+      </w:pPr>
+      <w:r>
+        <w:rPr>
+          <w:rFonts w:ascii="Arial" w:hAnsi="Arial"/>
+          <w:b/>
+          <w:color w:val="003470"/>
+          <w:sz w:val="19"/>
+        </w:rPr>
+        <w:t xml:space="preserve">• 6. Multi-Platform Client &amp; Voice Interface (Flutter &amp; Web Speech API): </w:t>
+      </w:r>
+      <w:r>
+        <w:rPr>
+          <w:rFonts w:ascii="Arial" w:hAnsi="Arial"/>
+          <w:color w:val="1E293B"/>
+          <w:sz w:val="19"/>
+        </w:rPr>
+        <w:t>The client app (port 4000) is built with Flutter 3.x (Dart), featuring hands-free Speech-To-Text mic recognition (Web Speech API) and automatic SpeechSynthesis Voice-Over output with manual replay speaker buttons.</w:t>
+      </w:r>
+    </w:p>
+    <w:p>
+      <w:pPr>
+        <w:spacing w:before="280" w:after="120"/>
+      </w:pPr>
+      <w:r>
+        <w:rPr>
+          <w:rFonts w:ascii="Arial" w:hAnsi="Arial"/>
+          <w:b/>
+          <w:color w:val="003470"/>
+          <w:sz w:val="30"/>
+        </w:rPr>
+        <w:t>4. Asian Christian Academy AI Agent Ecosystem</w:t>
       </w:r>
     </w:p>
     <w:p>
@@ -176,7 +322,7 @@
           <w:color w:val="003470"/>
           <w:sz w:val="25"/>
         </w:rPr>
-        <w:t>3.1 Active Agents Created So Far</w:t>
+        <w:t>4.1 Active Agents Created So Far</w:t>
       </w:r>
     </w:p>
     <w:p>
@@ -285,7 +431,7 @@
           <w:color w:val="003470"/>
           <w:sz w:val="25"/>
         </w:rPr>
-        <w:t>3.2 New AI Agents Planned for Future Development</w:t>
+        <w:t>4.2 New AI Agents Planned for Future Development</w:t>
       </w:r>
     </w:p>
     <w:p>
@@ -394,7 +540,7 @@
           <w:color w:val="003470"/>
           <w:sz w:val="30"/>
         </w:rPr>
-        <w:t>4. Strategic 10-Year Programming Language Evaluation (2026–2036)</w:t>
+        <w:t>5. Programming Language Evaluation for Custom AI Development</w:t>
       </w:r>
     </w:p>
     <w:tbl>
@@ -440,7 +586,7 @@
                 <w:color w:val="FFFFFF"/>
                 <w:sz w:val="19"/>
               </w:rPr>
-              <w:t>10-Year Future Suitability</w:t>
+              <w:t>Suitability</w:t>
             </w:r>
           </w:p>
         </w:tc>

</xml_diff>

<commit_message>
Update architecture blueprint: Suppress PDF browser print header/footer, remove all port numbers, and revert architecture chart to clean structure
</commit_message>
<xml_diff>
--- a/PROJECT_OVERALL_ARCHITECTURE.docx
+++ b/PROJECT_OVERALL_ARCHITECTURE.docx
@@ -84,7 +84,7 @@
         </w:rPr>
         <w:t>+-----------------------------------------------------------------------------------------+</w:t>
         <w:br/>
-        <w:t>|  1. FRAMEWORKS &amp; UI ENGINE (Port 4000)                                                  |</w:t>
+        <w:t>|  1. FRAMEWORKS &amp; UI ENGINE                                                              |</w:t>
         <w:br/>
         <w:t>|  Flutter 3.x (Dart) | Riverpod &amp; GoRouter | Web Speech STT + SpeechSynthesis TTS        |</w:t>
         <w:br/>
@@ -110,7 +110,7 @@
         <w:br/>
         <w:t>|  3. API GATEWAYS &amp; BRIDGES                                                              |</w:t>
         <w:br/>
-        <w:t>|  Central ChatService Engine (ValueNotifier Event Bus) -&gt; Express API (Port 4001)        |</w:t>
+        <w:t>|  Central ChatService Engine (ValueNotifier Event Bus) -&gt; Express API Gateway            |</w:t>
         <w:br/>
         <w:t>+-----------------------------------------------------------------------------------------+</w:t>
         <w:br/>
@@ -272,7 +272,7 @@
           <w:color w:val="1E293B"/>
           <w:sz w:val="19"/>
         </w:rPr>
-        <w:t>The backend microservice (port 4001) manages RAG document retrieval (ragService.js), autonomous function calling (agentService.js), and Human-In-The-Loop safety staging (agent_pending_actions).</w:t>
+        <w:t>The backend microservice manages RAG document retrieval (ragService.js), autonomous function calling (agentService.js), and Human-In-The-Loop safety staging (agent_pending_actions).</w:t>
       </w:r>
     </w:p>
     <w:p>
@@ -294,7 +294,7 @@
           <w:color w:val="1E293B"/>
           <w:sz w:val="19"/>
         </w:rPr>
-        <w:t>The client app (port 4000) is built with Flutter 3.x (Dart), featuring hands-free Speech-To-Text mic recognition (Web Speech API) and automatic SpeechSynthesis Voice-Over output with manual replay speaker buttons.</w:t>
+        <w:t>The client app is built with Flutter 3.x (Dart), featuring hands-free Speech-To-Text mic recognition (Web Speech API) and automatic SpeechSynthesis Voice-Over output with manual replay speaker buttons.</w:t>
       </w:r>
     </w:p>
     <w:p>

</xml_diff>

<commit_message>
Apply technical audit fixes across all architecture documents (HTML, PDF, DOCX, MD): Mermaid syntax & line breaks, layer structure, security/ops band, tech stack alignment, and copy hygiene
</commit_message>
<xml_diff>
--- a/PROJECT_OVERALL_ARCHITECTURE.docx
+++ b/PROJECT_OVERALL_ARCHITECTURE.docx
@@ -15,7 +15,7 @@
         </w:rPr>
         <w:t>Asian Christian Academy of India</w:t>
         <w:br/>
-        <w:t>HRMs-ERP &amp; Proprietary Custom AI Engine Blueprint</w:t>
+        <w:t>HRMS-ERP &amp; Self-Hosted AI Engine Blueprint</w:t>
       </w:r>
     </w:p>
     <w:p>
@@ -28,9 +28,9 @@
           <w:color w:val="64748B"/>
           <w:sz w:val="22"/>
         </w:rPr>
-        <w:t>Proprietary AI Strategy, Development Frameworks, Agent Portfolio &amp; Language Evaluation</w:t>
+        <w:t>Self-Hosted Open-Weight Strategy, Infrastructure Engineering &amp; Agent Portfolio</w:t>
         <w:br/>
-        <w:t>Version 3.0.0 Custom AI</w:t>
+        <w:t>Version 1.0.0 · Document Review: August 2026</w:t>
       </w:r>
     </w:p>
     <w:p/>
@@ -45,7 +45,7 @@
           <w:color w:val="003470"/>
           <w:sz w:val="30"/>
         </w:rPr>
-        <w:t>1. Executive Summary &amp; Proprietary AI Vision</w:t>
+        <w:t>1. Executive Summary &amp; Self-Hosted AI Vision</w:t>
       </w:r>
     </w:p>
     <w:p>
@@ -54,7 +54,7 @@
           <w:rFonts w:ascii="Arial" w:hAnsi="Arial"/>
           <w:sz w:val="20"/>
         </w:rPr>
-        <w:t>This master architectural blueprint defines the technical specification, system design, agent portfolio, and custom development stack for building a 100% proprietary, self-hosted AI Engine for Asian Christian Academy of India. The system operates with total independence—eliminating third-party cloud API keys (zero OpenAI, zero Claude, zero Gemini API keys)—guaranteeing complete data privacy, zero per-token API costs, and sub-millisecond execution over a self-hosted neural model architecture.</w:t>
+        <w:t>This master architectural blueprint defines the technical specification, system design, agent portfolio, and infrastructure stack for building a 100% self-hosted, privately fine-tuned AI Engine for Asian Christian Academy of India. The system operates with total independence—eliminating third-party cloud API dependencies (zero OpenAI, zero Claude, zero Gemini API keys)—guaranteeing complete enterprise data privacy, zero per-token API costs, and low latency (30–150 ms TTFT) over a self-hosted open-weight model runtime.</w:t>
       </w:r>
     </w:p>
     <w:p>
@@ -68,7 +68,7 @@
           <w:color w:val="003470"/>
           <w:sz w:val="30"/>
         </w:rPr>
-        <w:t>2. Master System Architecture Chart (Self-Hosted Custom AI)</w:t>
+        <w:t>2. Master System Architecture Chart (Self-Hosted Open Weights)</w:t>
       </w:r>
     </w:p>
     <w:p>
@@ -84,9 +84,9 @@
         </w:rPr>
         <w:t>+-----------------------------------------------------------------------------------------+</w:t>
         <w:br/>
-        <w:t>|  1. FRAMEWORKS &amp; UI ENGINE                                                              |</w:t>
+        <w:t>|  1. GLOBAL CLIENT UI ENGINE                                                             |</w:t>
         <w:br/>
-        <w:t>|  Flutter 3.x (Dart) | Riverpod &amp; GoRouter | Web Speech STT + SpeechSynthesis TTS        |</w:t>
+        <w:t>|  Flutter 3.x (Dart) | Riverpod &amp; GoRouter | Self-hosted STT + Platform TTS              |</w:t>
         <w:br/>
         <w:t>+-----------------------------------------------------------------------------------------+</w:t>
         <w:br/>
@@ -96,9 +96,9 @@
         <w:br/>
         <w:t>+-----------------------------------------------------------------------------------------+</w:t>
         <w:br/>
-        <w:t>|  2. ASIAN CHRISTIAN ACADEMY ERP APPLICATION MODULES                                     |</w:t>
+        <w:t>|  2. ACA INDIA HRMS-ERP APPLICATION MODULES                                              |</w:t>
         <w:br/>
-        <w:t>|  Dashboard (Presence/Polls) | Me (Attendance/Leaves) | Helpdesk (8 Depts) | Teams Chat |</w:t>
+        <w:t>|  Dashboard (Presence/Polls) | Me (Attendance/Leaves) | Helpdesk (6 Depts) | Teams Chat |</w:t>
         <w:br/>
         <w:t>+-----------------------------------------------------------------------------------------+</w:t>
         <w:br/>
@@ -108,9 +108,9 @@
         <w:br/>
         <w:t>+-----------------------------------------------------------------------------------------+</w:t>
         <w:br/>
-        <w:t>|  3. API GATEWAYS &amp; BRIDGES                                                              |</w:t>
+        <w:t>|  3. EDGE &amp; API GATEWAY                                                                  |</w:t>
         <w:br/>
-        <w:t>|  Central ChatService Engine (ValueNotifier Event Bus) -&gt; Express API Gateway            |</w:t>
+        <w:t>|  nginx Edge (TLS 1.3, WAF, Rate Limit) -&gt; Node.js Express API (JWT + RBAC Policy Check) |</w:t>
         <w:br/>
         <w:t>+-----------------------------------------------------------------------------------------+</w:t>
         <w:br/>
@@ -120,9 +120,9 @@
         <w:br/>
         <w:t>+-----------------------------------------------------------------------------------------+</w:t>
         <w:br/>
-        <w:t>|  4. ACTIVE &amp; PLANNED AI AGENT ECOSYSTEM                                                 |</w:t>
+        <w:t>|  4. AI AGENT ECOSYSTEM                                                                  |</w:t>
         <w:br/>
-        <w:t>|  RAG Policy Agent | Action Agent | Payroll Agent | Attendance Audit Agent | Vision Agent |</w:t>
+        <w:t>|  RAG Policy Agent | Action Agent | (Planned: Payroll | Attendance Audit | Vision OCR)    |</w:t>
         <w:br/>
         <w:t>+-----------------------------------------------------------------------------------------+</w:t>
         <w:br/>
@@ -132,21 +132,21 @@
         <w:br/>
         <w:t>+-----------------------------------------------------------------------------------------+</w:t>
         <w:br/>
-        <w:t>|  5. PROPRIETARY NATIVE AI ENGINE (Self-Hosted Custom Stack)                            |</w:t>
+        <w:t>|  5. SELF-HOSTED INFERENCE &amp; DATA                                                        |</w:t>
         <w:br/>
-        <w:t>|  Proprietary LLM &amp; Tensor Engine (Zero API Keys) &lt;-&gt; Enterprise Relational &amp; Vector DB  |</w:t>
+        <w:t>|  vLLM / llama.cpp Serving (LoRA Adapters) &lt;-&gt; Postgres 16 + pgvector (Unified DB)        |</w:t>
         <w:br/>
         <w:t>+-----------------------------------------------------------------------------------------+</w:t>
         <w:br/>
-        <w:t xml:space="preserve">                                        : (Expansion Phase)                                </w:t>
+        <w:t xml:space="preserve">                                        |                                                  </w:t>
         <w:br/>
         <w:t xml:space="preserve">                                        v                                                  </w:t>
         <w:br/>
         <w:t>+-----------------------------------------------------------------------------------------+</w:t>
         <w:br/>
-        <w:t>|  6. FUTURE AI TECHNOLOGY ROADMAP                                                        |</w:t>
+        <w:t>|  CROSS-CUTTING: SECURITY &amp; OPERATIONS                                                   |</w:t>
         <w:br/>
-        <w:t>|  Rust High-Performance Engine | Multi-Agent Swarm | SSE Streaming | GraphRAG | On-Device  |</w:t>
+        <w:t>|  SSO / IdP Auth | BullMQ + Redis Job Queue | Metrics &amp; Tracing | Encrypted Backups   |</w:t>
         <w:br/>
         <w:t>+-----------------------------------------------------------------------------------------+</w:t>
       </w:r>
@@ -162,7 +162,7 @@
           <w:color w:val="003470"/>
           <w:sz w:val="30"/>
         </w:rPr>
-        <w:t>3. Custom AI Development Stack &amp; Codebase Engineering</w:t>
+        <w:t>3. Custom AI Infrastructure &amp; Engineering Stack</w:t>
       </w:r>
     </w:p>
     <w:p>
@@ -176,7 +176,7 @@
           <w:color w:val="003470"/>
           <w:sz w:val="19"/>
         </w:rPr>
-        <w:t xml:space="preserve">• 1. AI Model Fine-Tuning Framework (Python, PyTorch &amp; LoRA): </w:t>
+        <w:t xml:space="preserve">• 1. Model Fine-Tuning Framework (Python, PyTorch &amp; LoRA): </w:t>
       </w:r>
       <w:r>
         <w:rPr>
@@ -184,7 +184,7 @@
           <w:color w:val="1E293B"/>
           <w:sz w:val="19"/>
         </w:rPr>
-        <w:t>The neural model is fine-tuned on custom Asian Christian Academy of India HR policies, leave rules, and SOPs using PyTorch, HuggingFace Transformers, and PEFT / LoRA (Low-Rank Adaptation).</w:t>
+        <w:t>The core intelligence engine uses open-weight base models (e.g. Llama 3 / Gemma 2) fine-tuned on Asian Christian Academy of India HR policies, leave rules, and SOP documents using PyTorch, HuggingFace Transformers, and PEFT / LoRA (Low-Rank Adaptation).</w:t>
       </w:r>
     </w:p>
     <w:p>
@@ -198,7 +198,7 @@
           <w:color w:val="003470"/>
           <w:sz w:val="19"/>
         </w:rPr>
-        <w:t xml:space="preserve">• 2. Low-Latency Local Inference Engine (vLLM &amp; llama.cpp): </w:t>
+        <w:t xml:space="preserve">• 2. Dual-Tier Self-Hosted Inference Runtime (vLLM &amp; llama.cpp): </w:t>
       </w:r>
       <w:r>
         <w:rPr>
@@ -206,7 +206,7 @@
           <w:color w:val="1E293B"/>
           <w:sz w:val="19"/>
         </w:rPr>
-        <w:t>Model execution runs on a self-hosted inference engine powered by vLLM and llama.cpp (GGUF / GGML 4-bit &amp; 8-bit Quantization), giving sub-millisecond tensor response speeds while keeping 100% of employee data private on local servers.</w:t>
+        <w:t>Model serving is structured in two operational tiers: vLLM (PagedAttention) provides primary GPU serving for high concurrent campus traffic (achieving 30–150 ms time-to-first-token), with llama.cpp (GGUF Quantization) acting as a low-power CPU fallback server.</w:t>
       </w:r>
     </w:p>
     <w:p>
@@ -220,7 +220,7 @@
           <w:color w:val="003470"/>
           <w:sz w:val="19"/>
         </w:rPr>
-        <w:t xml:space="preserve">• 3. Custom BPE Tokenizer &amp; Domain Lexicon: </w:t>
+        <w:t xml:space="preserve">• 3. Private Self-Hosted STT &amp; Native Platform TTS: </w:t>
       </w:r>
       <w:r>
         <w:rPr>
@@ -228,7 +228,7 @@
           <w:color w:val="1E293B"/>
           <w:sz w:val="19"/>
         </w:rPr>
-        <w:t>A custom Byte-Pair Encoding (BPE) tokenizer vocabulary is trained on ACA India organizational terminology, department codes (CPD, HOB, Media, Maintenance), and employee designations.</w:t>
+        <w:t>To preserve complete data privacy, client voice input uses self-hosted whisper.cpp / faster-whisper speech-to-text models hosted on the local gateway, paired with native platform SpeechSynthesis voice-over engines on client devices.</w:t>
       </w:r>
     </w:p>
     <w:p>
@@ -242,7 +242,7 @@
           <w:color w:val="003470"/>
           <w:sz w:val="19"/>
         </w:rPr>
-        <w:t xml:space="preserve">• 4. High-Performance Core Language Strategy (Rust &amp; C++): </w:t>
+        <w:t xml:space="preserve">• 4. Edge Security &amp; TLS Termination (nginx &amp; Express API Gateway): </w:t>
       </w:r>
       <w:r>
         <w:rPr>
@@ -250,7 +250,7 @@
           <w:color w:val="1E293B"/>
           <w:sz w:val="19"/>
         </w:rPr>
-        <w:t>For core high-throughput tensor operations and vector search indexing, the underlying engine uses Rust (Burn / Candle framework) and C++ / CUDA for memory-safe execution on GPU hardware.</w:t>
+        <w:t>All traffic from mobile, web, and campus devices is encrypted in transit using TLS 1.3 HTTPS terminated at an nginx / Cloudflare edge node (with WAF and rate limiting) before routing to the Node.js / Express API service with JWT user authentication and RBAC policy enforcement.</w:t>
       </w:r>
     </w:p>
     <w:p>
@@ -264,7 +264,7 @@
           <w:color w:val="003470"/>
           <w:sz w:val="19"/>
         </w:rPr>
-        <w:t xml:space="preserve">• 5. Backend Gateway &amp; Microservice Codebase (Node.js / Express): </w:t>
+        <w:t xml:space="preserve">• 5. Unified Relational &amp; Vector Storage (Postgres 16 + pgvector): </w:t>
       </w:r>
       <w:r>
         <w:rPr>
@@ -272,7 +272,7 @@
           <w:color w:val="1E293B"/>
           <w:sz w:val="19"/>
         </w:rPr>
-        <w:t>The backend microservice manages RAG document retrieval (ragService.js), autonomous function calling (agentService.js), and Human-In-The-Loop safety staging (agent_pending_actions).</w:t>
+        <w:t>Relational ERP tables (employees, leaves, tickets, audit logs) and 1536-dimensional RAG document embeddings (knowledge_chunks) are stored in a unified Postgres 16 + pgvector database, guaranteeing transactional consistency and simplified single-node backup routines (RPO 24h / RTO 4h).</w:t>
       </w:r>
     </w:p>
     <w:p>
@@ -286,7 +286,7 @@
           <w:color w:val="003470"/>
           <w:sz w:val="19"/>
         </w:rPr>
-        <w:t xml:space="preserve">• 6. Multi-Platform Client &amp; Voice Interface (Flutter &amp; Web Speech API): </w:t>
+        <w:t xml:space="preserve">• 6. Cross-Cutting Operations (BullMQ, Redis &amp; Security Services): </w:t>
       </w:r>
       <w:r>
         <w:rPr>
@@ -294,7 +294,7 @@
           <w:color w:val="1E293B"/>
           <w:sz w:val="19"/>
         </w:rPr>
-        <w:t>The client app is built with Flutter 3.x (Dart), featuring hands-free Speech-To-Text mic recognition (Web Speech API) and automatic SpeechSynthesis Voice-Over output with manual replay speaker buttons.</w:t>
+        <w:t>Long-running background tasks are managed via a BullMQ + Redis job queue. System health is monitored through open metrics and structured logging, backed by automated nightly AES-256 encrypted backups.</w:t>
       </w:r>
     </w:p>
     <w:p>
@@ -322,7 +322,7 @@
           <w:color w:val="003470"/>
           <w:sz w:val="25"/>
         </w:rPr>
-        <w:t>4.1 Active Agents Created So Far</w:t>
+        <w:t>4.1 Active Core Agents &amp; Services</w:t>
       </w:r>
     </w:p>
     <w:p>
@@ -371,7 +371,7 @@
           <w:color w:val="003470"/>
           <w:sz w:val="19"/>
         </w:rPr>
-        <w:t xml:space="preserve">• 💬 Central Synchronization Agent (ChatService): </w:t>
+        <w:t xml:space="preserve">• 💬 Central Event Bus (ChatService): </w:t>
       </w:r>
       <w:r>
         <w:rPr>
@@ -379,7 +379,7 @@
           <w:color w:val="1E293B"/>
           <w:sz w:val="19"/>
         </w:rPr>
-        <w:t>Event bus synchronizing chat messages across floating chatbots, drawers, and team channels.</w:t>
+        <w:t>Cross-window synchronization service broadcasting live chat updates.</w:t>
       </w:r>
     </w:p>
     <w:p>
@@ -390,7 +390,7 @@
           <w:color w:val="003470"/>
           <w:sz w:val="19"/>
         </w:rPr>
-        <w:t xml:space="preserve">• 🎙️ Voice &amp; Speech Agent (VoiceHelper): </w:t>
+        <w:t xml:space="preserve">• 🎙️ Voice I/O Interface (VoiceHelper): </w:t>
       </w:r>
       <w:r>
         <w:rPr>
@@ -398,7 +398,7 @@
           <w:color w:val="1E293B"/>
           <w:sz w:val="19"/>
         </w:rPr>
-        <w:t>Hands-free mic speech recognition &amp; automatic SpeechSynthesis Voice-Over output.</w:t>
+        <w:t>Client-side voice interaction wrapper managing mic audio and TTS playback.</w:t>
       </w:r>
     </w:p>
     <w:p>
@@ -409,7 +409,7 @@
           <w:color w:val="003470"/>
           <w:sz w:val="19"/>
         </w:rPr>
-        <w:t xml:space="preserve">• 🛡️ HITL Safety Agent: </w:t>
+        <w:t xml:space="preserve">• 🛡️ HITL Safety Manager: </w:t>
       </w:r>
       <w:r>
         <w:rPr>
@@ -417,7 +417,7 @@
           <w:color w:val="1E293B"/>
           <w:sz w:val="19"/>
         </w:rPr>
-        <w:t>Evaluates risk classification (LOW/MEDIUM/HIGH) and stages high-risk actions in agent_pending_actions.</w:t>
+        <w:t>Staging service placing high-risk database mutations in agent_pending_actions for confirmation.</w:t>
       </w:r>
     </w:p>
     <w:p>
@@ -431,7 +431,7 @@
           <w:color w:val="003470"/>
           <w:sz w:val="25"/>
         </w:rPr>
-        <w:t>4.2 New AI Agents Planned for Future Development</w:t>
+        <w:t>4.2 Planned Expansion Agents</w:t>
       </w:r>
     </w:p>
     <w:p>
@@ -461,7 +461,7 @@
           <w:color w:val="003470"/>
           <w:sz w:val="19"/>
         </w:rPr>
-        <w:t xml:space="preserve">• ⏰ Attendance &amp; Shift Anomaly Audit Agent: </w:t>
+        <w:t xml:space="preserve">• ⏰ Attendance &amp; Shift Anomaly Agent: </w:t>
       </w:r>
       <w:r>
         <w:rPr>
@@ -499,7 +499,7 @@
           <w:color w:val="003470"/>
           <w:sz w:val="19"/>
         </w:rPr>
-        <w:t xml:space="preserve">• 🏷️ IT Diagnostic &amp; Procurement Specialist: </w:t>
+        <w:t xml:space="preserve">• 🏷️ IT Diagnostic &amp; Asset Specialist: </w:t>
       </w:r>
       <w:r>
         <w:rPr>
@@ -540,7 +540,7 @@
           <w:color w:val="003470"/>
           <w:sz w:val="30"/>
         </w:rPr>
-        <w:t>5. Programming Language Evaluation for Custom AI Development</w:t>
+        <w:t>5. Programming Language Evaluation for Self-Hosted AI Infrastructure</w:t>
       </w:r>
     </w:p>
     <w:tbl>
@@ -586,7 +586,7 @@
                 <w:color w:val="FFFFFF"/>
                 <w:sz w:val="19"/>
               </w:rPr>
-              <w:t>Suitability</w:t>
+              <w:t>Evaluation &amp; Suitability</w:t>
             </w:r>
           </w:p>
         </w:tc>
@@ -603,7 +603,7 @@
                 <w:color w:val="FFFFFF"/>
                 <w:sz w:val="19"/>
               </w:rPr>
-              <w:t>Strengths for Proprietary AI Development</w:t>
+              <w:t>Strengths for Self-Hosted AI</w:t>
             </w:r>
           </w:p>
         </w:tc>
@@ -620,7 +620,7 @@
                 <w:color w:val="1E293B"/>
                 <w:sz w:val="18"/>
               </w:rPr>
-              <w:t>🦀 Rust (RECOMMENDED CORE)</w:t>
+              <w:t>Rust</w:t>
             </w:r>
           </w:p>
         </w:tc>
@@ -635,7 +635,7 @@
                 <w:color w:val="1E293B"/>
                 <w:sz w:val="18"/>
               </w:rPr>
-              <w:t>Highest (5/5 Stars)</w:t>
+              <w:t>5/5 - Recommended Core</w:t>
             </w:r>
           </w:p>
         </w:tc>
@@ -650,7 +650,7 @@
                 <w:color w:val="1E293B"/>
                 <w:sz w:val="18"/>
               </w:rPr>
-              <w:t>Memory safety without GC pauses, zero-cost abstractions, native C/CUDA interop, blazing fast tensor execution (Burn, Candle), WebAssembly compilation.</w:t>
+              <w:t>Memory safety without GC pauses, zero-cost abstractions, native C/CUDA interop, high-speed tensor libraries (Candle / Burn), WebAssembly compilation.</w:t>
             </w:r>
           </w:p>
         </w:tc>
@@ -667,7 +667,7 @@
                 <w:color w:val="1E293B"/>
                 <w:sz w:val="18"/>
               </w:rPr>
-              <w:t>🐍 Python</w:t>
+              <w:t>Python</w:t>
             </w:r>
           </w:p>
         </w:tc>
@@ -682,7 +682,7 @@
                 <w:color w:val="1E293B"/>
                 <w:sz w:val="18"/>
               </w:rPr>
-              <w:t>High (4/5 Stars - R&amp;D)</w:t>
+              <w:t>4/5 - Essential Fine-Tuning</w:t>
             </w:r>
           </w:p>
         </w:tc>
@@ -697,7 +697,7 @@
                 <w:color w:val="1E293B"/>
                 <w:sz w:val="18"/>
               </w:rPr>
-              <w:t>Unrivaled AI ecosystem (PyTorch, JAX, HuggingFace, vLLM). Essential for model fine-tuning &amp; research.</w:t>
+              <w:t>Unrivaled AI ecosystem (PyTorch, JAX, HuggingFace, vLLM). Standard language for dataset preparation and LoRA adapter fine-tuning.</w:t>
             </w:r>
           </w:p>
         </w:tc>
@@ -714,7 +714,7 @@
                 <w:color w:val="1E293B"/>
                 <w:sz w:val="18"/>
               </w:rPr>
-              <w:t>⚡ C++ / CUDA</w:t>
+              <w:t>C++ / CUDA</w:t>
             </w:r>
           </w:p>
         </w:tc>
@@ -729,7 +729,7 @@
                 <w:color w:val="1E293B"/>
                 <w:sz w:val="18"/>
               </w:rPr>
-              <w:t>High (4/5 Stars - Low Level)</w:t>
+              <w:t>4/5 - Low-Level GPU Kernels</w:t>
             </w:r>
           </w:p>
         </w:tc>
@@ -744,7 +744,7 @@
                 <w:color w:val="1E293B"/>
                 <w:sz w:val="18"/>
               </w:rPr>
-              <w:t>Foundation of GGML, llama.cpp, and TensorRT. Maximum low-level GPU hardware control.</w:t>
+              <w:t>Foundation of GGUF, llama.cpp, and TensorRT. Maximum low-level GPU hardware control.</w:t>
             </w:r>
           </w:p>
         </w:tc>
@@ -761,7 +761,7 @@
                 <w:color w:val="1E293B"/>
                 <w:sz w:val="18"/>
               </w:rPr>
-              <w:t>🔥 Mojo / Julia</w:t>
+              <w:t>Mojo</w:t>
             </w:r>
           </w:p>
         </w:tc>
@@ -776,7 +776,7 @@
                 <w:color w:val="1E293B"/>
                 <w:sz w:val="18"/>
               </w:rPr>
-              <w:t>Emerging (3/5 Stars)</w:t>
+              <w:t>3/5 - Emerging AI Tech</w:t>
             </w:r>
           </w:p>
         </w:tc>
@@ -791,7 +791,7 @@
                 <w:color w:val="1E293B"/>
                 <w:sz w:val="18"/>
               </w:rPr>
-              <w:t>Mojo compiles Python syntax to native C speed. High-performance matrix math capabilities.</w:t>
+              <w:t>Python superset compiling to native C speed with high-performance matrix math capabilities.</w:t>
             </w:r>
           </w:p>
         </w:tc>

</xml_diff>